<commit_message>
Clarify manual trial date scope
</commit_message>
<xml_diff>
--- a/docs/manual/SDDA-TrialDesk-Secretary-Manual.docx
+++ b/docs/manual/SDDA-TrialDesk-Secretary-Manual.docx
@@ -206,7 +206,7 @@
                 <w:color w:val="18231D"/>
                 <w:sz w:val="19"/>
               </w:rPr>
-              <w:t>1.0 • August 23, 2026</w:t>
+              <w:t>1.1 • August 23, 2026</w:t>
             </w:r>
           </w:p>
         </w:tc>
@@ -260,7 +260,7 @@
                 <w:color w:val="18231D"/>
                 <w:sz w:val="19"/>
               </w:rPr>
-              <w:t>Scent, Games, and Combined trials • 1–4 days</w:t>
+              <w:t>Scent, Games, and Combined trials</w:t>
             </w:r>
           </w:p>
         </w:tc>
@@ -637,7 +637,7 @@
                 <w:color w:val="18231D"/>
                 <w:sz w:val="19"/>
               </w:rPr>
-              <w:t>Trial name, host club, venue name, full address, and 1–4 dates</w:t>
+              <w:t>Trial name, host club, venue name, full address, and trial dates</w:t>
             </w:r>
           </w:p>
         </w:tc>
@@ -1072,7 +1072,7 @@
         <w:t xml:space="preserve">1. Sign in. </w:t>
       </w:r>
       <w:r>
-        <w:t>Use the secretary account. A database-appointed administrator can access all trials; other users see trials they own or have been assigned.</w:t>
+        <w:t>Use the secretary account assigned to the trial.</w:t>
       </w:r>
     </w:p>
     <w:p>
@@ -1129,10 +1129,10 @@
           <w:b/>
           <w:color w:val="225F45"/>
         </w:rPr>
-        <w:t xml:space="preserve">5. Add one to four dates. </w:t>
-      </w:r>
-      <w:r>
-        <w:t>Enter unique dates in chronological order. Each becomes a separate trial day in TrialDesk.</w:t>
+        <w:t xml:space="preserve">5. Add the trial dates. </w:t>
+      </w:r>
+      <w:r>
+        <w:t>Enter unique dates in chronological order. Each becomes a separate trial day in TrialDesk. TrialDesk currently accepts one to four dates; this is an application limit, not an SDDA rule.</w:t>
       </w:r>
     </w:p>
     <w:p>
@@ -3545,7 +3545,7 @@
                 <w:color w:val="18231D"/>
                 <w:sz w:val="19"/>
               </w:rPr>
-              <w:t>Confirm the signed-in profile is owner/member or database-appointed administrator; confirm required migrations were applied.</w:t>
+              <w:t>Confirm the signed-in profile has access to the trial and that the required migrations were applied.</w:t>
             </w:r>
           </w:p>
         </w:tc>

</xml_diff>

<commit_message>
Use current TrialDesk running order in manual
</commit_message>
<xml_diff>
--- a/docs/manual/SDDA-TrialDesk-Secretary-Manual.docx
+++ b/docs/manual/SDDA-TrialDesk-Secretary-Manual.docx
@@ -1952,7 +1952,7 @@
       <w:r>
         <w:drawing>
           <wp:inline xmlns:a="http://schemas.openxmlformats.org/drawingml/2006/main" xmlns:pic="http://schemas.openxmlformats.org/drawingml/2006/picture">
-            <wp:extent cx="6217920" cy="2238238"/>
+            <wp:extent cx="6217920" cy="1039470"/>
             <wp:docPr id="4" name="Picture 4" descr="Running order workbook"/>
             <wp:cNvGraphicFramePr>
               <a:graphicFrameLocks noChangeAspect="1"/>
@@ -1973,7 +1973,7 @@
                   <pic:spPr>
                     <a:xfrm>
                       <a:off x="0" y="0"/>
-                      <a:ext cx="6217920" cy="2238238"/>
+                      <a:ext cx="6217920" cy="1039470"/>
                     </a:xfrm>
                     <a:prstGeom prst="rect"/>
                   </pic:spPr>
@@ -1995,7 +1995,7 @@
           <w:color w:val="68736C"/>
           <w:sz w:val="17"/>
         </w:rPr>
-        <w:t>Figure 4. Running-order workbook example. TrialDesk exports one formatted worksheet per day; review names, group sequencing, conflicts, and timing estimates before posting.</w:t>
+        <w:t>Figure 4. Header from an actual TrialDesk running-order export. Each day receives its own worksheet with a day total, trial metadata, level-coloured class bands, component columns, reactive indicators, and class totals. Review the complete workbook’s names, streams, run groups, conflicts, and sequence before posting.</w:t>
       </w:r>
     </w:p>
     <w:p>

</xml_diff>

<commit_message>
Document trial editing and copying
</commit_message>
<xml_diff>
--- a/docs/manual/SDDA-TrialDesk-Secretary-Manual.docx
+++ b/docs/manual/SDDA-TrialDesk-Secretary-Manual.docx
@@ -206,7 +206,7 @@
                 <w:color w:val="18232F"/>
                 <w:sz w:val="19"/>
               </w:rPr>
-              <w:t>1.3 • September 3, 2026</w:t>
+              <w:t>1.4 • September 14, 2026</w:t>
             </w:r>
           </w:p>
         </w:tc>
@@ -1267,6 +1267,132 @@
       <w:pPr>
         <w:spacing w:after="0"/>
       </w:pPr>
+    </w:p>
+    <w:p>
+      <w:pPr>
+        <w:pStyle w:val="Heading2"/>
+      </w:pPr>
+      <w:r>
+        <w:t>2.1 Edit an existing trial</w:t>
+      </w:r>
+    </w:p>
+    <w:p>
+      <w:pPr>
+        <w:ind w:left="72" w:hanging="72"/>
+      </w:pPr>
+      <w:r>
+        <w:rPr>
+          <w:b/>
+          <w:color w:val="294F73"/>
+        </w:rPr>
+        <w:t xml:space="preserve">1. Open All Trials. </w:t>
+      </w:r>
+      <w:r>
+        <w:t>Find the trial and select Edit trial. The same editor is available from the trial's edit address.</w:t>
+      </w:r>
+    </w:p>
+    <w:p>
+      <w:pPr>
+        <w:ind w:left="72" w:hanging="72"/>
+      </w:pPr>
+      <w:r>
+        <w:rPr>
+          <w:b/>
+          <w:color w:val="294F73"/>
+        </w:rPr>
+        <w:t xml:space="preserve">2. Update trial identity. </w:t>
+      </w:r>
+      <w:r>
+        <w:t>Change the trial name, host club, venue/address, or Scent/Games/Combined format, then select Save trial changes.</w:t>
+      </w:r>
+    </w:p>
+    <w:p>
+      <w:pPr>
+        <w:ind w:left="72" w:hanging="72"/>
+      </w:pPr>
+      <w:r>
+        <w:rPr>
+          <w:b/>
+          <w:color w:val="294F73"/>
+        </w:rPr>
+        <w:t xml:space="preserve">3. Update trial days. </w:t>
+      </w:r>
+      <w:r>
+        <w:t>Revise dates, add days up to the four-day TrialDesk limit, or remove only the final day. Enter dates chronologically and select Save trial days.</w:t>
+      </w:r>
+    </w:p>
+    <w:p>
+      <w:r>
+        <w:t>Date changes preserve each existing Day number and everything attached to it. Removing a day is blocked until its offerings are cleared and it contains no competitor runs. Reopen a completed trial before making schedule changes.</w:t>
+      </w:r>
+    </w:p>
+    <w:p>
+      <w:pPr>
+        <w:pStyle w:val="Heading2"/>
+      </w:pPr>
+      <w:r>
+        <w:t>2.2 Copy a trial</w:t>
+      </w:r>
+    </w:p>
+    <w:p>
+      <w:pPr>
+        <w:ind w:left="72" w:hanging="72"/>
+      </w:pPr>
+      <w:r>
+        <w:rPr>
+          <w:b/>
+          <w:color w:val="294F73"/>
+        </w:rPr>
+        <w:t xml:space="preserve">1. Select Copy trial. </w:t>
+      </w:r>
+      <w:r>
+        <w:t>Use the control on an All Trials card or at the bottom of Edit trial.</w:t>
+      </w:r>
+    </w:p>
+    <w:p>
+      <w:pPr>
+        <w:ind w:left="72" w:hanging="72"/>
+      </w:pPr>
+      <w:r>
+        <w:rPr>
+          <w:b/>
+          <w:color w:val="294F73"/>
+        </w:rPr>
+        <w:t xml:space="preserve">2. Name the new trial and enter its dates. </w:t>
+      </w:r>
+      <w:r>
+        <w:t>Provide one new chronological date for every day in the source trial.</w:t>
+      </w:r>
+    </w:p>
+    <w:p>
+      <w:pPr>
+        <w:ind w:left="72" w:hanging="72"/>
+      </w:pPr>
+      <w:r>
+        <w:rPr>
+          <w:b/>
+          <w:color w:val="294F73"/>
+        </w:rPr>
+        <w:t xml:space="preserve">3. Review the copy boundary. </w:t>
+      </w:r>
+      <w:r>
+        <w:t>TrialDesk copies the club, venue, format, public instructions, pricing, capacities, FEO settings, and offerings. It does not copy entries, dogs, runs, scores, payments, expenses, trial numbers, or judges.</w:t>
+      </w:r>
+    </w:p>
+    <w:p>
+      <w:pPr>
+        <w:ind w:left="72" w:hanging="72"/>
+      </w:pPr>
+      <w:r>
+        <w:rPr>
+          <w:b/>
+          <w:color w:val="294F73"/>
+        </w:rPr>
+        <w:t xml:space="preserve">4. Create draft copy. </w:t>
+      </w:r>
+      <w:r>
+        <w:t>Open the new draft, review every setting, enter new trial numbers and judges, and only then open entries.</w:t>
+      </w:r>
     </w:p>
     <w:p>
       <w:r>
@@ -5639,6 +5765,175 @@
                 <w:sz w:val="19"/>
               </w:rPr>
               <w:t>Opens the selected trial workspace.</w:t>
+            </w:r>
+          </w:p>
+        </w:tc>
+      </w:tr>
+      <w:tr>
+        <w:tc>
+          <w:tcPr>
+            <w:tcW w:type="dxa" w:w="2736"/>
+            <w:vAlign w:val="center"/>
+            <w:tcMar>
+              <w:top w:w="80" w:type="dxa"/>
+              <w:start w:w="120" w:type="dxa"/>
+              <w:bottom w:w="80" w:type="dxa"/>
+              <w:end w:w="120" w:type="dxa"/>
+            </w:tcMar>
+            <w:shd w:fill="F7F8F4"/>
+          </w:tcPr>
+          <w:p>
+            <w:pPr>
+              <w:spacing w:after="0"/>
+            </w:pPr>
+            <w:r/>
+            <w:r>
+              <w:rPr>
+                <w:rFonts w:ascii="Calibri" w:hAnsi="Calibri"/>
+                <w:b w:val="0"/>
+                <w:color w:val="18232F"/>
+                <w:sz w:val="19"/>
+              </w:rPr>
+              <w:t>Edit trial</w:t>
+            </w:r>
+          </w:p>
+        </w:tc>
+        <w:tc>
+          <w:tcPr>
+            <w:tcW w:type="dxa" w:w="2592"/>
+            <w:vAlign w:val="center"/>
+            <w:tcMar>
+              <w:top w:w="80" w:type="dxa"/>
+              <w:start w:w="120" w:type="dxa"/>
+              <w:bottom w:w="80" w:type="dxa"/>
+              <w:end w:w="120" w:type="dxa"/>
+            </w:tcMar>
+            <w:shd w:fill="F7F8F4"/>
+          </w:tcPr>
+          <w:p>
+            <w:pPr>
+              <w:spacing w:after="0"/>
+            </w:pPr>
+            <w:r/>
+            <w:r>
+              <w:rPr>
+                <w:rFonts w:ascii="Calibri" w:hAnsi="Calibri"/>
+                <w:b w:val="0"/>
+                <w:color w:val="18232F"/>
+                <w:sz w:val="19"/>
+              </w:rPr>
+              <w:t>All Trials card</w:t>
+            </w:r>
+          </w:p>
+        </w:tc>
+        <w:tc>
+          <w:tcPr>
+            <w:tcW w:type="dxa" w:w="5616"/>
+            <w:vAlign w:val="center"/>
+            <w:tcMar>
+              <w:top w:w="80" w:type="dxa"/>
+              <w:start w:w="120" w:type="dxa"/>
+              <w:bottom w:w="80" w:type="dxa"/>
+              <w:end w:w="120" w:type="dxa"/>
+            </w:tcMar>
+            <w:shd w:fill="F7F8F4"/>
+          </w:tcPr>
+          <w:p>
+            <w:pPr>
+              <w:spacing w:after="0"/>
+            </w:pPr>
+            <w:r/>
+            <w:r>
+              <w:rPr>
+                <w:rFonts w:ascii="Calibri" w:hAnsi="Calibri"/>
+                <w:b w:val="0"/>
+                <w:color w:val="18232F"/>
+                <w:sz w:val="19"/>
+              </w:rPr>
+              <w:t>Opens identity, format, and guarded trial-day editing for the selected trial.</w:t>
+            </w:r>
+          </w:p>
+        </w:tc>
+      </w:tr>
+      <w:tr>
+        <w:tc>
+          <w:tcPr>
+            <w:tcW w:type="dxa" w:w="2736"/>
+            <w:vAlign w:val="center"/>
+            <w:tcMar>
+              <w:top w:w="80" w:type="dxa"/>
+              <w:start w:w="120" w:type="dxa"/>
+              <w:bottom w:w="80" w:type="dxa"/>
+              <w:end w:w="120" w:type="dxa"/>
+            </w:tcMar>
+          </w:tcPr>
+          <w:p>
+            <w:pPr>
+              <w:spacing w:after="0"/>
+            </w:pPr>
+            <w:r/>
+            <w:r>
+              <w:rPr>
+                <w:rFonts w:ascii="Calibri" w:hAnsi="Calibri"/>
+                <w:b w:val="0"/>
+                <w:color w:val="18232F"/>
+                <w:sz w:val="19"/>
+              </w:rPr>
+              <w:t>Copy trial</w:t>
+            </w:r>
+          </w:p>
+        </w:tc>
+        <w:tc>
+          <w:tcPr>
+            <w:tcW w:type="dxa" w:w="2592"/>
+            <w:vAlign w:val="center"/>
+            <w:tcMar>
+              <w:top w:w="80" w:type="dxa"/>
+              <w:start w:w="120" w:type="dxa"/>
+              <w:bottom w:w="80" w:type="dxa"/>
+              <w:end w:w="120" w:type="dxa"/>
+            </w:tcMar>
+          </w:tcPr>
+          <w:p>
+            <w:pPr>
+              <w:spacing w:after="0"/>
+            </w:pPr>
+            <w:r/>
+            <w:r>
+              <w:rPr>
+                <w:rFonts w:ascii="Calibri" w:hAnsi="Calibri"/>
+                <w:b w:val="0"/>
+                <w:color w:val="18232F"/>
+                <w:sz w:val="19"/>
+              </w:rPr>
+              <w:t>All Trials card or Edit trial</w:t>
+            </w:r>
+          </w:p>
+        </w:tc>
+        <w:tc>
+          <w:tcPr>
+            <w:tcW w:type="dxa" w:w="5616"/>
+            <w:vAlign w:val="center"/>
+            <w:tcMar>
+              <w:top w:w="80" w:type="dxa"/>
+              <w:start w:w="120" w:type="dxa"/>
+              <w:bottom w:w="80" w:type="dxa"/>
+              <w:end w:w="120" w:type="dxa"/>
+            </w:tcMar>
+          </w:tcPr>
+          <w:p>
+            <w:pPr>
+              <w:spacing w:after="0"/>
+            </w:pPr>
+            <w:r/>
+            <w:r>
+              <w:rPr>
+                <w:rFonts w:ascii="Calibri" w:hAnsi="Calibri"/>
+                <w:b w:val="0"/>
+                <w:color w:val="18232F"/>
+                <w:sz w:val="19"/>
+              </w:rPr>
+              <w:t>Starts a clean draft using reusable setup from the selected trial.</w:t>
             </w:r>
           </w:p>
         </w:tc>
@@ -6429,6 +6724,428 @@
                 <w:color w:val="18232F"/>
                 <w:sz w:val="19"/>
               </w:rPr>
+              <w:t>Save trial changes</w:t>
+            </w:r>
+          </w:p>
+        </w:tc>
+        <w:tc>
+          <w:tcPr>
+            <w:tcW w:type="dxa" w:w="2592"/>
+            <w:vAlign w:val="center"/>
+            <w:tcMar>
+              <w:top w:w="80" w:type="dxa"/>
+              <w:start w:w="120" w:type="dxa"/>
+              <w:bottom w:w="80" w:type="dxa"/>
+              <w:end w:w="120" w:type="dxa"/>
+            </w:tcMar>
+          </w:tcPr>
+          <w:p>
+            <w:pPr>
+              <w:spacing w:after="0"/>
+            </w:pPr>
+            <w:r/>
+            <w:r>
+              <w:rPr>
+                <w:rFonts w:ascii="Calibri" w:hAnsi="Calibri"/>
+                <w:b w:val="0"/>
+                <w:color w:val="18232F"/>
+                <w:sz w:val="19"/>
+              </w:rPr>
+              <w:t>Edit trial</w:t>
+            </w:r>
+          </w:p>
+        </w:tc>
+        <w:tc>
+          <w:tcPr>
+            <w:tcW w:type="dxa" w:w="5616"/>
+            <w:vAlign w:val="center"/>
+            <w:tcMar>
+              <w:top w:w="80" w:type="dxa"/>
+              <w:start w:w="120" w:type="dxa"/>
+              <w:bottom w:w="80" w:type="dxa"/>
+              <w:end w:w="120" w:type="dxa"/>
+            </w:tcMar>
+          </w:tcPr>
+          <w:p>
+            <w:pPr>
+              <w:spacing w:after="0"/>
+            </w:pPr>
+            <w:r/>
+            <w:r>
+              <w:rPr>
+                <w:rFonts w:ascii="Calibri" w:hAnsi="Calibri"/>
+                <w:b w:val="0"/>
+                <w:color w:val="18232F"/>
+                <w:sz w:val="19"/>
+              </w:rPr>
+              <w:t>Saves the trial name, host club, venue/address, and format without changing entries or runs.</w:t>
+            </w:r>
+          </w:p>
+        </w:tc>
+      </w:tr>
+      <w:tr>
+        <w:tc>
+          <w:tcPr>
+            <w:tcW w:type="dxa" w:w="2736"/>
+            <w:vAlign w:val="center"/>
+            <w:tcMar>
+              <w:top w:w="80" w:type="dxa"/>
+              <w:start w:w="120" w:type="dxa"/>
+              <w:bottom w:w="80" w:type="dxa"/>
+              <w:end w:w="120" w:type="dxa"/>
+            </w:tcMar>
+            <w:shd w:fill="F7F8F4"/>
+          </w:tcPr>
+          <w:p>
+            <w:pPr>
+              <w:spacing w:after="0"/>
+            </w:pPr>
+            <w:r/>
+            <w:r>
+              <w:rPr>
+                <w:rFonts w:ascii="Calibri" w:hAnsi="Calibri"/>
+                <w:b w:val="0"/>
+                <w:color w:val="18232F"/>
+                <w:sz w:val="19"/>
+              </w:rPr>
+              <w:t>Add trial day</w:t>
+            </w:r>
+          </w:p>
+        </w:tc>
+        <w:tc>
+          <w:tcPr>
+            <w:tcW w:type="dxa" w:w="2592"/>
+            <w:vAlign w:val="center"/>
+            <w:tcMar>
+              <w:top w:w="80" w:type="dxa"/>
+              <w:start w:w="120" w:type="dxa"/>
+              <w:bottom w:w="80" w:type="dxa"/>
+              <w:end w:w="120" w:type="dxa"/>
+            </w:tcMar>
+            <w:shd w:fill="F7F8F4"/>
+          </w:tcPr>
+          <w:p>
+            <w:pPr>
+              <w:spacing w:after="0"/>
+            </w:pPr>
+            <w:r/>
+            <w:r>
+              <w:rPr>
+                <w:rFonts w:ascii="Calibri" w:hAnsi="Calibri"/>
+                <w:b w:val="0"/>
+                <w:color w:val="18232F"/>
+                <w:sz w:val="19"/>
+              </w:rPr>
+              <w:t>Edit trial</w:t>
+            </w:r>
+          </w:p>
+        </w:tc>
+        <w:tc>
+          <w:tcPr>
+            <w:tcW w:type="dxa" w:w="5616"/>
+            <w:vAlign w:val="center"/>
+            <w:tcMar>
+              <w:top w:w="80" w:type="dxa"/>
+              <w:start w:w="120" w:type="dxa"/>
+              <w:bottom w:w="80" w:type="dxa"/>
+              <w:end w:w="120" w:type="dxa"/>
+            </w:tcMar>
+            <w:shd w:fill="F7F8F4"/>
+          </w:tcPr>
+          <w:p>
+            <w:pPr>
+              <w:spacing w:after="0"/>
+            </w:pPr>
+            <w:r/>
+            <w:r>
+              <w:rPr>
+                <w:rFonts w:ascii="Calibri" w:hAnsi="Calibri"/>
+                <w:b w:val="0"/>
+                <w:color w:val="18232F"/>
+                <w:sz w:val="19"/>
+              </w:rPr>
+              <w:t>Adds another empty trial day, up to four.</w:t>
+            </w:r>
+          </w:p>
+        </w:tc>
+      </w:tr>
+      <w:tr>
+        <w:tc>
+          <w:tcPr>
+            <w:tcW w:type="dxa" w:w="2736"/>
+            <w:vAlign w:val="center"/>
+            <w:tcMar>
+              <w:top w:w="80" w:type="dxa"/>
+              <w:start w:w="120" w:type="dxa"/>
+              <w:bottom w:w="80" w:type="dxa"/>
+              <w:end w:w="120" w:type="dxa"/>
+            </w:tcMar>
+          </w:tcPr>
+          <w:p>
+            <w:pPr>
+              <w:spacing w:after="0"/>
+            </w:pPr>
+            <w:r/>
+            <w:r>
+              <w:rPr>
+                <w:rFonts w:ascii="Calibri" w:hAnsi="Calibri"/>
+                <w:b w:val="0"/>
+                <w:color w:val="18232F"/>
+                <w:sz w:val="19"/>
+              </w:rPr>
+              <w:t>Remove Day</w:t>
+            </w:r>
+          </w:p>
+        </w:tc>
+        <w:tc>
+          <w:tcPr>
+            <w:tcW w:type="dxa" w:w="2592"/>
+            <w:vAlign w:val="center"/>
+            <w:tcMar>
+              <w:top w:w="80" w:type="dxa"/>
+              <w:start w:w="120" w:type="dxa"/>
+              <w:bottom w:w="80" w:type="dxa"/>
+              <w:end w:w="120" w:type="dxa"/>
+            </w:tcMar>
+          </w:tcPr>
+          <w:p>
+            <w:pPr>
+              <w:spacing w:after="0"/>
+            </w:pPr>
+            <w:r/>
+            <w:r>
+              <w:rPr>
+                <w:rFonts w:ascii="Calibri" w:hAnsi="Calibri"/>
+                <w:b w:val="0"/>
+                <w:color w:val="18232F"/>
+                <w:sz w:val="19"/>
+              </w:rPr>
+              <w:t>Edit trial</w:t>
+            </w:r>
+          </w:p>
+        </w:tc>
+        <w:tc>
+          <w:tcPr>
+            <w:tcW w:type="dxa" w:w="5616"/>
+            <w:vAlign w:val="center"/>
+            <w:tcMar>
+              <w:top w:w="80" w:type="dxa"/>
+              <w:start w:w="120" w:type="dxa"/>
+              <w:bottom w:w="80" w:type="dxa"/>
+              <w:end w:w="120" w:type="dxa"/>
+            </w:tcMar>
+          </w:tcPr>
+          <w:p>
+            <w:pPr>
+              <w:spacing w:after="0"/>
+            </w:pPr>
+            <w:r/>
+            <w:r>
+              <w:rPr>
+                <w:rFonts w:ascii="Calibri" w:hAnsi="Calibri"/>
+                <w:b w:val="0"/>
+                <w:color w:val="18232F"/>
+                <w:sz w:val="19"/>
+              </w:rPr>
+              <w:t>Removes only the final day and is blocked while that day has offerings or runs.</w:t>
+            </w:r>
+          </w:p>
+        </w:tc>
+      </w:tr>
+      <w:tr>
+        <w:tc>
+          <w:tcPr>
+            <w:tcW w:type="dxa" w:w="2736"/>
+            <w:vAlign w:val="center"/>
+            <w:tcMar>
+              <w:top w:w="80" w:type="dxa"/>
+              <w:start w:w="120" w:type="dxa"/>
+              <w:bottom w:w="80" w:type="dxa"/>
+              <w:end w:w="120" w:type="dxa"/>
+            </w:tcMar>
+            <w:shd w:fill="F7F8F4"/>
+          </w:tcPr>
+          <w:p>
+            <w:pPr>
+              <w:spacing w:after="0"/>
+            </w:pPr>
+            <w:r/>
+            <w:r>
+              <w:rPr>
+                <w:rFonts w:ascii="Calibri" w:hAnsi="Calibri"/>
+                <w:b w:val="0"/>
+                <w:color w:val="18232F"/>
+                <w:sz w:val="19"/>
+              </w:rPr>
+              <w:t>Save trial days</w:t>
+            </w:r>
+          </w:p>
+        </w:tc>
+        <w:tc>
+          <w:tcPr>
+            <w:tcW w:type="dxa" w:w="2592"/>
+            <w:vAlign w:val="center"/>
+            <w:tcMar>
+              <w:top w:w="80" w:type="dxa"/>
+              <w:start w:w="120" w:type="dxa"/>
+              <w:bottom w:w="80" w:type="dxa"/>
+              <w:end w:w="120" w:type="dxa"/>
+            </w:tcMar>
+            <w:shd w:fill="F7F8F4"/>
+          </w:tcPr>
+          <w:p>
+            <w:pPr>
+              <w:spacing w:after="0"/>
+            </w:pPr>
+            <w:r/>
+            <w:r>
+              <w:rPr>
+                <w:rFonts w:ascii="Calibri" w:hAnsi="Calibri"/>
+                <w:b w:val="0"/>
+                <w:color w:val="18232F"/>
+                <w:sz w:val="19"/>
+              </w:rPr>
+              <w:t>Edit trial</w:t>
+            </w:r>
+          </w:p>
+        </w:tc>
+        <w:tc>
+          <w:tcPr>
+            <w:tcW w:type="dxa" w:w="5616"/>
+            <w:vAlign w:val="center"/>
+            <w:tcMar>
+              <w:top w:w="80" w:type="dxa"/>
+              <w:start w:w="120" w:type="dxa"/>
+              <w:bottom w:w="80" w:type="dxa"/>
+              <w:end w:w="120" w:type="dxa"/>
+            </w:tcMar>
+            <w:shd w:fill="F7F8F4"/>
+          </w:tcPr>
+          <w:p>
+            <w:pPr>
+              <w:spacing w:after="0"/>
+            </w:pPr>
+            <w:r/>
+            <w:r>
+              <w:rPr>
+                <w:rFonts w:ascii="Calibri" w:hAnsi="Calibri"/>
+                <w:b w:val="0"/>
+                <w:color w:val="18232F"/>
+                <w:sz w:val="19"/>
+              </w:rPr>
+              <w:t>Atomically saves chronological date changes while preserving existing day assignments.</w:t>
+            </w:r>
+          </w:p>
+        </w:tc>
+      </w:tr>
+      <w:tr>
+        <w:tc>
+          <w:tcPr>
+            <w:tcW w:type="dxa" w:w="2736"/>
+            <w:vAlign w:val="center"/>
+            <w:tcMar>
+              <w:top w:w="80" w:type="dxa"/>
+              <w:start w:w="120" w:type="dxa"/>
+              <w:bottom w:w="80" w:type="dxa"/>
+              <w:end w:w="120" w:type="dxa"/>
+            </w:tcMar>
+          </w:tcPr>
+          <w:p>
+            <w:pPr>
+              <w:spacing w:after="0"/>
+            </w:pPr>
+            <w:r/>
+            <w:r>
+              <w:rPr>
+                <w:rFonts w:ascii="Calibri" w:hAnsi="Calibri"/>
+                <w:b w:val="0"/>
+                <w:color w:val="18232F"/>
+                <w:sz w:val="19"/>
+              </w:rPr>
+              <w:t>Create draft copy</w:t>
+            </w:r>
+          </w:p>
+        </w:tc>
+        <w:tc>
+          <w:tcPr>
+            <w:tcW w:type="dxa" w:w="2592"/>
+            <w:vAlign w:val="center"/>
+            <w:tcMar>
+              <w:top w:w="80" w:type="dxa"/>
+              <w:start w:w="120" w:type="dxa"/>
+              <w:bottom w:w="80" w:type="dxa"/>
+              <w:end w:w="120" w:type="dxa"/>
+            </w:tcMar>
+          </w:tcPr>
+          <w:p>
+            <w:pPr>
+              <w:spacing w:after="0"/>
+            </w:pPr>
+            <w:r/>
+            <w:r>
+              <w:rPr>
+                <w:rFonts w:ascii="Calibri" w:hAnsi="Calibri"/>
+                <w:b w:val="0"/>
+                <w:color w:val="18232F"/>
+                <w:sz w:val="19"/>
+              </w:rPr>
+              <w:t>Copy trial</w:t>
+            </w:r>
+          </w:p>
+        </w:tc>
+        <w:tc>
+          <w:tcPr>
+            <w:tcW w:type="dxa" w:w="5616"/>
+            <w:vAlign w:val="center"/>
+            <w:tcMar>
+              <w:top w:w="80" w:type="dxa"/>
+              <w:start w:w="120" w:type="dxa"/>
+              <w:bottom w:w="80" w:type="dxa"/>
+              <w:end w:w="120" w:type="dxa"/>
+            </w:tcMar>
+          </w:tcPr>
+          <w:p>
+            <w:pPr>
+              <w:spacing w:after="0"/>
+            </w:pPr>
+            <w:r/>
+            <w:r>
+              <w:rPr>
+                <w:rFonts w:ascii="Calibri" w:hAnsi="Calibri"/>
+                <w:b w:val="0"/>
+                <w:color w:val="18232F"/>
+                <w:sz w:val="19"/>
+              </w:rPr>
+              <w:t>Creates a new draft with reusable setup but no operational or financial records.</w:t>
+            </w:r>
+          </w:p>
+        </w:tc>
+      </w:tr>
+      <w:tr>
+        <w:tc>
+          <w:tcPr>
+            <w:tcW w:type="dxa" w:w="2736"/>
+            <w:vAlign w:val="center"/>
+            <w:tcMar>
+              <w:top w:w="80" w:type="dxa"/>
+              <w:start w:w="120" w:type="dxa"/>
+              <w:bottom w:w="80" w:type="dxa"/>
+              <w:end w:w="120" w:type="dxa"/>
+            </w:tcMar>
+            <w:shd w:fill="F7F8F4"/>
+          </w:tcPr>
+          <w:p>
+            <w:pPr>
+              <w:spacing w:after="0"/>
+            </w:pPr>
+            <w:r/>
+            <w:r>
+              <w:rPr>
+                <w:rFonts w:ascii="Calibri" w:hAnsi="Calibri"/>
+                <w:b w:val="0"/>
+                <w:color w:val="18232F"/>
+                <w:sz w:val="19"/>
+              </w:rPr>
               <w:t>Save setup</w:t>
             </w:r>
           </w:p>
@@ -6443,6 +7160,7 @@
               <w:bottom w:w="80" w:type="dxa"/>
               <w:end w:w="120" w:type="dxa"/>
             </w:tcMar>
+            <w:shd w:fill="F7F8F4"/>
           </w:tcPr>
           <w:p>
             <w:pPr>
@@ -6470,6 +7188,7 @@
               <w:bottom w:w="80" w:type="dxa"/>
               <w:end w:w="120" w:type="dxa"/>
             </w:tcMar>
+            <w:shd w:fill="F7F8F4"/>
           </w:tcPr>
           <w:p>
             <w:pPr>
@@ -6499,7 +7218,6 @@
               <w:bottom w:w="80" w:type="dxa"/>
               <w:end w:w="120" w:type="dxa"/>
             </w:tcMar>
-            <w:shd w:fill="F7F8F4"/>
           </w:tcPr>
           <w:p>
             <w:pPr>
@@ -6527,7 +7245,6 @@
               <w:bottom w:w="80" w:type="dxa"/>
               <w:end w:w="120" w:type="dxa"/>
             </w:tcMar>
-            <w:shd w:fill="F7F8F4"/>
           </w:tcPr>
           <w:p>
             <w:pPr>
@@ -6555,7 +7272,6 @@
               <w:bottom w:w="80" w:type="dxa"/>
               <w:end w:w="120" w:type="dxa"/>
             </w:tcMar>
-            <w:shd w:fill="F7F8F4"/>
           </w:tcPr>
           <w:p>
             <w:pPr>
@@ -6585,6 +7301,7 @@
               <w:bottom w:w="80" w:type="dxa"/>
               <w:end w:w="120" w:type="dxa"/>
             </w:tcMar>
+            <w:shd w:fill="F7F8F4"/>
           </w:tcPr>
           <w:p>
             <w:pPr>
@@ -6599,90 +7316,6 @@
                 <w:sz w:val="19"/>
               </w:rPr>
               <w:t>Select all / Clear Scent</w:t>
-            </w:r>
-          </w:p>
-        </w:tc>
-        <w:tc>
-          <w:tcPr>
-            <w:tcW w:type="dxa" w:w="2592"/>
-            <w:vAlign w:val="center"/>
-            <w:tcMar>
-              <w:top w:w="80" w:type="dxa"/>
-              <w:start w:w="120" w:type="dxa"/>
-              <w:bottom w:w="80" w:type="dxa"/>
-              <w:end w:w="120" w:type="dxa"/>
-            </w:tcMar>
-          </w:tcPr>
-          <w:p>
-            <w:pPr>
-              <w:spacing w:after="0"/>
-            </w:pPr>
-            <w:r/>
-            <w:r>
-              <w:rPr>
-                <w:rFonts w:ascii="Calibri" w:hAnsi="Calibri"/>
-                <w:b w:val="0"/>
-                <w:color w:val="18232F"/>
-                <w:sz w:val="19"/>
-              </w:rPr>
-              <w:t>Trial offering setup</w:t>
-            </w:r>
-          </w:p>
-        </w:tc>
-        <w:tc>
-          <w:tcPr>
-            <w:tcW w:type="dxa" w:w="5616"/>
-            <w:vAlign w:val="center"/>
-            <w:tcMar>
-              <w:top w:w="80" w:type="dxa"/>
-              <w:start w:w="120" w:type="dxa"/>
-              <w:bottom w:w="80" w:type="dxa"/>
-              <w:end w:w="120" w:type="dxa"/>
-            </w:tcMar>
-          </w:tcPr>
-          <w:p>
-            <w:pPr>
-              <w:spacing w:after="0"/>
-            </w:pPr>
-            <w:r/>
-            <w:r>
-              <w:rPr>
-                <w:rFonts w:ascii="Calibri" w:hAnsi="Calibri"/>
-                <w:b w:val="0"/>
-                <w:color w:val="18232F"/>
-                <w:sz w:val="19"/>
-              </w:rPr>
-              <w:t>Selects or clears all Scent level/component offerings.</w:t>
-            </w:r>
-          </w:p>
-        </w:tc>
-      </w:tr>
-      <w:tr>
-        <w:tc>
-          <w:tcPr>
-            <w:tcW w:type="dxa" w:w="2736"/>
-            <w:vAlign w:val="center"/>
-            <w:tcMar>
-              <w:top w:w="80" w:type="dxa"/>
-              <w:start w:w="120" w:type="dxa"/>
-              <w:bottom w:w="80" w:type="dxa"/>
-              <w:end w:w="120" w:type="dxa"/>
-            </w:tcMar>
-            <w:shd w:fill="F7F8F4"/>
-          </w:tcPr>
-          <w:p>
-            <w:pPr>
-              <w:spacing w:after="0"/>
-            </w:pPr>
-            <w:r/>
-            <w:r>
-              <w:rPr>
-                <w:rFonts w:ascii="Calibri" w:hAnsi="Calibri"/>
-                <w:b w:val="0"/>
-                <w:color w:val="18232F"/>
-                <w:sz w:val="19"/>
-              </w:rPr>
-              <w:t>Select all / Clear Games</w:t>
             </w:r>
           </w:p>
         </w:tc>
@@ -6738,7 +7371,7 @@
                 <w:color w:val="18232F"/>
                 <w:sz w:val="19"/>
               </w:rPr>
-              <w:t>Selects or clears all Games offerings.</w:t>
+              <w:t>Selects or clears all Scent level/component offerings.</w:t>
             </w:r>
           </w:p>
         </w:tc>
@@ -6767,6 +7400,90 @@
                 <w:color w:val="18232F"/>
                 <w:sz w:val="19"/>
               </w:rPr>
+              <w:t>Select all / Clear Games</w:t>
+            </w:r>
+          </w:p>
+        </w:tc>
+        <w:tc>
+          <w:tcPr>
+            <w:tcW w:type="dxa" w:w="2592"/>
+            <w:vAlign w:val="center"/>
+            <w:tcMar>
+              <w:top w:w="80" w:type="dxa"/>
+              <w:start w:w="120" w:type="dxa"/>
+              <w:bottom w:w="80" w:type="dxa"/>
+              <w:end w:w="120" w:type="dxa"/>
+            </w:tcMar>
+          </w:tcPr>
+          <w:p>
+            <w:pPr>
+              <w:spacing w:after="0"/>
+            </w:pPr>
+            <w:r/>
+            <w:r>
+              <w:rPr>
+                <w:rFonts w:ascii="Calibri" w:hAnsi="Calibri"/>
+                <w:b w:val="0"/>
+                <w:color w:val="18232F"/>
+                <w:sz w:val="19"/>
+              </w:rPr>
+              <w:t>Trial offering setup</w:t>
+            </w:r>
+          </w:p>
+        </w:tc>
+        <w:tc>
+          <w:tcPr>
+            <w:tcW w:type="dxa" w:w="5616"/>
+            <w:vAlign w:val="center"/>
+            <w:tcMar>
+              <w:top w:w="80" w:type="dxa"/>
+              <w:start w:w="120" w:type="dxa"/>
+              <w:bottom w:w="80" w:type="dxa"/>
+              <w:end w:w="120" w:type="dxa"/>
+            </w:tcMar>
+          </w:tcPr>
+          <w:p>
+            <w:pPr>
+              <w:spacing w:after="0"/>
+            </w:pPr>
+            <w:r/>
+            <w:r>
+              <w:rPr>
+                <w:rFonts w:ascii="Calibri" w:hAnsi="Calibri"/>
+                <w:b w:val="0"/>
+                <w:color w:val="18232F"/>
+                <w:sz w:val="19"/>
+              </w:rPr>
+              <w:t>Selects or clears all Games offerings.</w:t>
+            </w:r>
+          </w:p>
+        </w:tc>
+      </w:tr>
+      <w:tr>
+        <w:tc>
+          <w:tcPr>
+            <w:tcW w:type="dxa" w:w="2736"/>
+            <w:vAlign w:val="center"/>
+            <w:tcMar>
+              <w:top w:w="80" w:type="dxa"/>
+              <w:start w:w="120" w:type="dxa"/>
+              <w:bottom w:w="80" w:type="dxa"/>
+              <w:end w:w="120" w:type="dxa"/>
+            </w:tcMar>
+            <w:shd w:fill="F7F8F4"/>
+          </w:tcPr>
+          <w:p>
+            <w:pPr>
+              <w:spacing w:after="0"/>
+            </w:pPr>
+            <w:r/>
+            <w:r>
+              <w:rPr>
+                <w:rFonts w:ascii="Calibri" w:hAnsi="Calibri"/>
+                <w:b w:val="0"/>
+                <w:color w:val="18232F"/>
+                <w:sz w:val="19"/>
+              </w:rPr>
               <w:t>Save Scent pricing</w:t>
             </w:r>
           </w:p>
@@ -6781,6 +7498,7 @@
               <w:bottom w:w="80" w:type="dxa"/>
               <w:end w:w="120" w:type="dxa"/>
             </w:tcMar>
+            <w:shd w:fill="F7F8F4"/>
           </w:tcPr>
           <w:p>
             <w:pPr>
@@ -6808,6 +7526,7 @@
               <w:bottom w:w="80" w:type="dxa"/>
               <w:end w:w="120" w:type="dxa"/>
             </w:tcMar>
+            <w:shd w:fill="F7F8F4"/>
           </w:tcPr>
           <w:p>
             <w:pPr>
@@ -6837,6 +7556,89 @@
               <w:bottom w:w="80" w:type="dxa"/>
               <w:end w:w="120" w:type="dxa"/>
             </w:tcMar>
+          </w:tcPr>
+          <w:p>
+            <w:pPr>
+              <w:spacing w:after="0"/>
+            </w:pPr>
+            <w:r/>
+            <w:r>
+              <w:rPr>
+                <w:rFonts w:ascii="Calibri" w:hAnsi="Calibri"/>
+                <w:b w:val="0"/>
+                <w:color w:val="18232F"/>
+                <w:sz w:val="19"/>
+              </w:rPr>
+              <w:t>Open entries and enable form</w:t>
+            </w:r>
+          </w:p>
+        </w:tc>
+        <w:tc>
+          <w:tcPr>
+            <w:tcW w:type="dxa" w:w="2592"/>
+            <w:vAlign w:val="center"/>
+            <w:tcMar>
+              <w:top w:w="80" w:type="dxa"/>
+              <w:start w:w="120" w:type="dxa"/>
+              <w:bottom w:w="80" w:type="dxa"/>
+              <w:end w:w="120" w:type="dxa"/>
+            </w:tcMar>
+          </w:tcPr>
+          <w:p>
+            <w:pPr>
+              <w:spacing w:after="0"/>
+            </w:pPr>
+            <w:r/>
+            <w:r>
+              <w:rPr>
+                <w:rFonts w:ascii="Calibri" w:hAnsi="Calibri"/>
+                <w:b w:val="0"/>
+                <w:color w:val="18232F"/>
+                <w:sz w:val="19"/>
+              </w:rPr>
+              <w:t>Trial operations</w:t>
+            </w:r>
+          </w:p>
+        </w:tc>
+        <w:tc>
+          <w:tcPr>
+            <w:tcW w:type="dxa" w:w="5616"/>
+            <w:vAlign w:val="center"/>
+            <w:tcMar>
+              <w:top w:w="80" w:type="dxa"/>
+              <w:start w:w="120" w:type="dxa"/>
+              <w:bottom w:w="80" w:type="dxa"/>
+              <w:end w:w="120" w:type="dxa"/>
+            </w:tcMar>
+          </w:tcPr>
+          <w:p>
+            <w:pPr>
+              <w:spacing w:after="0"/>
+            </w:pPr>
+            <w:r/>
+            <w:r>
+              <w:rPr>
+                <w:rFonts w:ascii="Calibri" w:hAnsi="Calibri"/>
+                <w:b w:val="0"/>
+                <w:color w:val="18232F"/>
+                <w:sz w:val="19"/>
+              </w:rPr>
+              <w:t>Changes the trial to Entries Open and activates submissions.</w:t>
+            </w:r>
+          </w:p>
+        </w:tc>
+      </w:tr>
+      <w:tr>
+        <w:tc>
+          <w:tcPr>
+            <w:tcW w:type="dxa" w:w="2736"/>
+            <w:vAlign w:val="center"/>
+            <w:tcMar>
+              <w:top w:w="80" w:type="dxa"/>
+              <w:start w:w="120" w:type="dxa"/>
+              <w:bottom w:w="80" w:type="dxa"/>
+              <w:end w:w="120" w:type="dxa"/>
+            </w:tcMar>
             <w:shd w:fill="F7F8F4"/>
           </w:tcPr>
           <w:p>
@@ -6851,7 +7653,7 @@
                 <w:color w:val="18232F"/>
                 <w:sz w:val="19"/>
               </w:rPr>
-              <w:t>Open entries and enable form</w:t>
+              <w:t>Close entries</w:t>
             </w:r>
           </w:p>
         </w:tc>
@@ -6907,7 +7709,7 @@
                 <w:color w:val="18232F"/>
                 <w:sz w:val="19"/>
               </w:rPr>
-              <w:t>Changes the trial to Entries Open and activates submissions.</w:t>
+              <w:t>Stops new public submissions for the whole trial.</w:t>
             </w:r>
           </w:p>
         </w:tc>
@@ -6936,7 +7738,7 @@
                 <w:color w:val="18232F"/>
                 <w:sz w:val="19"/>
               </w:rPr>
-              <w:t>Close entries</w:t>
+              <w:t>Open or Close this day</w:t>
             </w:r>
           </w:p>
         </w:tc>
@@ -6963,7 +7765,7 @@
                 <w:color w:val="18232F"/>
                 <w:sz w:val="19"/>
               </w:rPr>
-              <w:t>Trial operations</w:t>
+              <w:t>Trial day header</w:t>
             </w:r>
           </w:p>
         </w:tc>
@@ -6990,7 +7792,7 @@
                 <w:color w:val="18232F"/>
                 <w:sz w:val="19"/>
               </w:rPr>
-              <w:t>Stops new public submissions for the whole trial.</w:t>
+              <w:t>Allows or stops entries for only that day.</w:t>
             </w:r>
           </w:p>
         </w:tc>
@@ -7020,7 +7822,7 @@
                 <w:color w:val="18232F"/>
                 <w:sz w:val="19"/>
               </w:rPr>
-              <w:t>Open or Close this day</w:t>
+              <w:t>Save day details</w:t>
             </w:r>
           </w:p>
         </w:tc>
@@ -7048,7 +7850,7 @@
                 <w:color w:val="18232F"/>
                 <w:sz w:val="19"/>
               </w:rPr>
-              <w:t>Trial day header</w:t>
+              <w:t>Trial day</w:t>
             </w:r>
           </w:p>
         </w:tc>
@@ -7063,89 +7865,6 @@
               <w:end w:w="120" w:type="dxa"/>
             </w:tcMar>
             <w:shd w:fill="F7F8F4"/>
-          </w:tcPr>
-          <w:p>
-            <w:pPr>
-              <w:spacing w:after="0"/>
-            </w:pPr>
-            <w:r/>
-            <w:r>
-              <w:rPr>
-                <w:rFonts w:ascii="Calibri" w:hAnsi="Calibri"/>
-                <w:b w:val="0"/>
-                <w:color w:val="18232F"/>
-                <w:sz w:val="19"/>
-              </w:rPr>
-              <w:t>Allows or stops entries for only that day.</w:t>
-            </w:r>
-          </w:p>
-        </w:tc>
-      </w:tr>
-      <w:tr>
-        <w:tc>
-          <w:tcPr>
-            <w:tcW w:type="dxa" w:w="2736"/>
-            <w:vAlign w:val="center"/>
-            <w:tcMar>
-              <w:top w:w="80" w:type="dxa"/>
-              <w:start w:w="120" w:type="dxa"/>
-              <w:bottom w:w="80" w:type="dxa"/>
-              <w:end w:w="120" w:type="dxa"/>
-            </w:tcMar>
-          </w:tcPr>
-          <w:p>
-            <w:pPr>
-              <w:spacing w:after="0"/>
-            </w:pPr>
-            <w:r/>
-            <w:r>
-              <w:rPr>
-                <w:rFonts w:ascii="Calibri" w:hAnsi="Calibri"/>
-                <w:b w:val="0"/>
-                <w:color w:val="18232F"/>
-                <w:sz w:val="19"/>
-              </w:rPr>
-              <w:t>Save day details</w:t>
-            </w:r>
-          </w:p>
-        </w:tc>
-        <w:tc>
-          <w:tcPr>
-            <w:tcW w:type="dxa" w:w="2592"/>
-            <w:vAlign w:val="center"/>
-            <w:tcMar>
-              <w:top w:w="80" w:type="dxa"/>
-              <w:start w:w="120" w:type="dxa"/>
-              <w:bottom w:w="80" w:type="dxa"/>
-              <w:end w:w="120" w:type="dxa"/>
-            </w:tcMar>
-          </w:tcPr>
-          <w:p>
-            <w:pPr>
-              <w:spacing w:after="0"/>
-            </w:pPr>
-            <w:r/>
-            <w:r>
-              <w:rPr>
-                <w:rFonts w:ascii="Calibri" w:hAnsi="Calibri"/>
-                <w:b w:val="0"/>
-                <w:color w:val="18232F"/>
-                <w:sz w:val="19"/>
-              </w:rPr>
-              <w:t>Trial day</w:t>
-            </w:r>
-          </w:p>
-        </w:tc>
-        <w:tc>
-          <w:tcPr>
-            <w:tcW w:type="dxa" w:w="5616"/>
-            <w:vAlign w:val="center"/>
-            <w:tcMar>
-              <w:top w:w="80" w:type="dxa"/>
-              <w:start w:w="120" w:type="dxa"/>
-              <w:bottom w:w="80" w:type="dxa"/>
-              <w:end w:w="120" w:type="dxa"/>
-            </w:tcMar>
           </w:tcPr>
           <w:p>
             <w:pPr>
@@ -7175,7 +7894,6 @@
               <w:bottom w:w="80" w:type="dxa"/>
               <w:end w:w="120" w:type="dxa"/>
             </w:tcMar>
-            <w:shd w:fill="F7F8F4"/>
           </w:tcPr>
           <w:p>
             <w:pPr>
@@ -7203,7 +7921,6 @@
               <w:bottom w:w="80" w:type="dxa"/>
               <w:end w:w="120" w:type="dxa"/>
             </w:tcMar>
-            <w:shd w:fill="F7F8F4"/>
           </w:tcPr>
           <w:p>
             <w:pPr>
@@ -7231,7 +7948,6 @@
               <w:bottom w:w="80" w:type="dxa"/>
               <w:end w:w="120" w:type="dxa"/>
             </w:tcMar>
-            <w:shd w:fill="F7F8F4"/>
           </w:tcPr>
           <w:p>
             <w:pPr>
@@ -7261,6 +7977,7 @@
               <w:bottom w:w="80" w:type="dxa"/>
               <w:end w:w="120" w:type="dxa"/>
             </w:tcMar>
+            <w:shd w:fill="F7F8F4"/>
           </w:tcPr>
           <w:p>
             <w:pPr>
@@ -7288,6 +8005,7 @@
               <w:bottom w:w="80" w:type="dxa"/>
               <w:end w:w="120" w:type="dxa"/>
             </w:tcMar>
+            <w:shd w:fill="F7F8F4"/>
           </w:tcPr>
           <w:p>
             <w:pPr>
@@ -7315,6 +8033,7 @@
               <w:bottom w:w="80" w:type="dxa"/>
               <w:end w:w="120" w:type="dxa"/>
             </w:tcMar>
+            <w:shd w:fill="F7F8F4"/>
           </w:tcPr>
           <w:p>
             <w:pPr>
@@ -7344,6 +8063,89 @@
               <w:bottom w:w="80" w:type="dxa"/>
               <w:end w:w="120" w:type="dxa"/>
             </w:tcMar>
+          </w:tcPr>
+          <w:p>
+            <w:pPr>
+              <w:spacing w:after="0"/>
+            </w:pPr>
+            <w:r/>
+            <w:r>
+              <w:rPr>
+                <w:rFonts w:ascii="Calibri" w:hAnsi="Calibri"/>
+                <w:b w:val="0"/>
+                <w:color w:val="18232F"/>
+                <w:sz w:val="19"/>
+              </w:rPr>
+              <w:t>Refresh from SDDA</w:t>
+            </w:r>
+          </w:p>
+        </w:tc>
+        <w:tc>
+          <w:tcPr>
+            <w:tcW w:type="dxa" w:w="2592"/>
+            <w:vAlign w:val="center"/>
+            <w:tcMar>
+              <w:top w:w="80" w:type="dxa"/>
+              <w:start w:w="120" w:type="dxa"/>
+              <w:bottom w:w="80" w:type="dxa"/>
+              <w:end w:w="120" w:type="dxa"/>
+            </w:tcMar>
+          </w:tcPr>
+          <w:p>
+            <w:pPr>
+              <w:spacing w:after="0"/>
+            </w:pPr>
+            <w:r/>
+            <w:r>
+              <w:rPr>
+                <w:rFonts w:ascii="Calibri" w:hAnsi="Calibri"/>
+                <w:b w:val="0"/>
+                <w:color w:val="18232F"/>
+                <w:sz w:val="19"/>
+              </w:rPr>
+              <w:t>SDDA Dog Registry</w:t>
+            </w:r>
+          </w:p>
+        </w:tc>
+        <w:tc>
+          <w:tcPr>
+            <w:tcW w:type="dxa" w:w="5616"/>
+            <w:vAlign w:val="center"/>
+            <w:tcMar>
+              <w:top w:w="80" w:type="dxa"/>
+              <w:start w:w="120" w:type="dxa"/>
+              <w:bottom w:w="80" w:type="dxa"/>
+              <w:end w:w="120" w:type="dxa"/>
+            </w:tcMar>
+          </w:tcPr>
+          <w:p>
+            <w:pPr>
+              <w:spacing w:after="0"/>
+            </w:pPr>
+            <w:r/>
+            <w:r>
+              <w:rPr>
+                <w:rFonts w:ascii="Calibri" w:hAnsi="Calibri"/>
+                <w:b w:val="0"/>
+                <w:color w:val="18232F"/>
+                <w:sz w:val="19"/>
+              </w:rPr>
+              <w:t>Stages and activates the newest official SDDA Dogs list; administrator only.</w:t>
+            </w:r>
+          </w:p>
+        </w:tc>
+      </w:tr>
+      <w:tr>
+        <w:tc>
+          <w:tcPr>
+            <w:tcW w:type="dxa" w:w="2736"/>
+            <w:vAlign w:val="center"/>
+            <w:tcMar>
+              <w:top w:w="80" w:type="dxa"/>
+              <w:start w:w="120" w:type="dxa"/>
+              <w:bottom w:w="80" w:type="dxa"/>
+              <w:end w:w="120" w:type="dxa"/>
+            </w:tcMar>
             <w:shd w:fill="F7F8F4"/>
           </w:tcPr>
           <w:p>
@@ -7358,7 +8160,7 @@
                 <w:color w:val="18232F"/>
                 <w:sz w:val="19"/>
               </w:rPr>
-              <w:t>Refresh from SDDA</w:t>
+              <w:t>Search registry</w:t>
             </w:r>
           </w:p>
         </w:tc>
@@ -7401,89 +8203,6 @@
               <w:end w:w="120" w:type="dxa"/>
             </w:tcMar>
             <w:shd w:fill="F7F8F4"/>
-          </w:tcPr>
-          <w:p>
-            <w:pPr>
-              <w:spacing w:after="0"/>
-            </w:pPr>
-            <w:r/>
-            <w:r>
-              <w:rPr>
-                <w:rFonts w:ascii="Calibri" w:hAnsi="Calibri"/>
-                <w:b w:val="0"/>
-                <w:color w:val="18232F"/>
-                <w:sz w:val="19"/>
-              </w:rPr>
-              <w:t>Stages and activates the newest official SDDA Dogs list; administrator only.</w:t>
-            </w:r>
-          </w:p>
-        </w:tc>
-      </w:tr>
-      <w:tr>
-        <w:tc>
-          <w:tcPr>
-            <w:tcW w:type="dxa" w:w="2736"/>
-            <w:vAlign w:val="center"/>
-            <w:tcMar>
-              <w:top w:w="80" w:type="dxa"/>
-              <w:start w:w="120" w:type="dxa"/>
-              <w:bottom w:w="80" w:type="dxa"/>
-              <w:end w:w="120" w:type="dxa"/>
-            </w:tcMar>
-          </w:tcPr>
-          <w:p>
-            <w:pPr>
-              <w:spacing w:after="0"/>
-            </w:pPr>
-            <w:r/>
-            <w:r>
-              <w:rPr>
-                <w:rFonts w:ascii="Calibri" w:hAnsi="Calibri"/>
-                <w:b w:val="0"/>
-                <w:color w:val="18232F"/>
-                <w:sz w:val="19"/>
-              </w:rPr>
-              <w:t>Search registry</w:t>
-            </w:r>
-          </w:p>
-        </w:tc>
-        <w:tc>
-          <w:tcPr>
-            <w:tcW w:type="dxa" w:w="2592"/>
-            <w:vAlign w:val="center"/>
-            <w:tcMar>
-              <w:top w:w="80" w:type="dxa"/>
-              <w:start w:w="120" w:type="dxa"/>
-              <w:bottom w:w="80" w:type="dxa"/>
-              <w:end w:w="120" w:type="dxa"/>
-            </w:tcMar>
-          </w:tcPr>
-          <w:p>
-            <w:pPr>
-              <w:spacing w:after="0"/>
-            </w:pPr>
-            <w:r/>
-            <w:r>
-              <w:rPr>
-                <w:rFonts w:ascii="Calibri" w:hAnsi="Calibri"/>
-                <w:b w:val="0"/>
-                <w:color w:val="18232F"/>
-                <w:sz w:val="19"/>
-              </w:rPr>
-              <w:t>SDDA Dog Registry</w:t>
-            </w:r>
-          </w:p>
-        </w:tc>
-        <w:tc>
-          <w:tcPr>
-            <w:tcW w:type="dxa" w:w="5616"/>
-            <w:vAlign w:val="center"/>
-            <w:tcMar>
-              <w:top w:w="80" w:type="dxa"/>
-              <w:start w:w="120" w:type="dxa"/>
-              <w:bottom w:w="80" w:type="dxa"/>
-              <w:end w:w="120" w:type="dxa"/>
-            </w:tcMar>
           </w:tcPr>
           <w:p>
             <w:pPr>
@@ -13153,7 +13872,7 @@
     </w:p>
     <w:p>
       <w:r>
-        <w:t>The operating sequence, primary pages, and visible controls were reviewed against K:\TrialManager and the deployed Example Trial interface on September 3, 2026. Screenshots show read-only inspection and previously prepared unsaved finance dialogs; no live transactions or operational changes were submitted for this manual. The current SDDA rulebook and official forms remain controlling.</w:t>
+        <w:t>The operating sequence, primary pages, and visible controls were reviewed against K:\TrialManager through September 14, 2026. Screenshots show read-only inspection and previously prepared unsaved finance dialogs; no live transactions or operational changes were submitted for this manual. The current SDDA rulebook and official forms remain controlling.</w:t>
       </w:r>
     </w:p>
     <w:tbl>

</xml_diff>

<commit_message>
Add secretary-entered registration workflow
</commit_message>
<xml_diff>
--- a/docs/manual/SDDA-TrialDesk-Secretary-Manual.docx
+++ b/docs/manual/SDDA-TrialDesk-Secretary-Manual.docx
@@ -2102,7 +2102,65 @@
         <w:pStyle w:val="Heading2"/>
       </w:pPr>
       <w:r>
-        <w:t>4.3 Review and accept entries</w:t>
+        <w:t>4.3 Enter a paper or day-of entry</w:t>
+      </w:r>
+    </w:p>
+    <w:p>
+      <w:pPr>
+        <w:ind w:left="72" w:hanging="72"/>
+      </w:pPr>
+      <w:r>
+        <w:rPr>
+          <w:b/>
+          <w:color w:val="294F73"/>
+        </w:rPr>
+        <w:t xml:space="preserve">1. Open Entries. </w:t>
+      </w:r>
+      <w:r>
+        <w:t>Select Add secretary entry above the roster.</w:t>
+      </w:r>
+    </w:p>
+    <w:p>
+      <w:pPr>
+        <w:ind w:left="72" w:hanging="72"/>
+      </w:pPr>
+      <w:r>
+        <w:rPr>
+          <w:b/>
+          <w:color w:val="294F73"/>
+        </w:rPr>
+        <w:t xml:space="preserve">2. Transcribe the complete entry. </w:t>
+      </w:r>
+      <w:r>
+        <w:t>Enter the competitor and dog information, choose every requested run, review the declaration with the competitor, and confirm the Review page before saving.</w:t>
+      </w:r>
+    </w:p>
+    <w:p>
+      <w:pPr>
+        <w:ind w:left="72" w:hanging="72"/>
+      </w:pPr>
+      <w:r>
+        <w:rPr>
+          <w:b/>
+          <w:color w:val="294F73"/>
+        </w:rPr>
+        <w:t xml:space="preserve">3. Submit and review. </w:t>
+      </w:r>
+      <w:r>
+        <w:t>TrialDesk returns to the Entry roster. The record is identified as a manual secretary entry and the activity journal attributes it to the signed-in secretary.</w:t>
+      </w:r>
+    </w:p>
+    <w:p>
+      <w:r>
+        <w:t>The same registry, offering, FEO, stream, and required-field checks used by the public form also apply to secretary-entered records. If online entries are closed, reopen the applicable entry period before adding the record, then close it again when finished.</w:t>
+      </w:r>
+    </w:p>
+    <w:p>
+      <w:pPr>
+        <w:pStyle w:val="Heading2"/>
+      </w:pPr>
+      <w:r>
+        <w:t>4.4 Review and accept entries</w:t>
       </w:r>
     </w:p>
     <w:p>
@@ -10423,7 +10481,7 @@
                 <w:color w:val="18232F"/>
                 <w:sz w:val="19"/>
               </w:rPr>
-              <w:t>Import Google Form CSV</w:t>
+              <w:t>Add secretary entry</w:t>
             </w:r>
           </w:p>
         </w:tc>
@@ -10479,7 +10537,7 @@
                 <w:color w:val="18232F"/>
                 <w:sz w:val="19"/>
               </w:rPr>
-              <w:t>Selects and previews a familiar Google response CSV.</w:t>
+              <w:t>Opens the full entry form for a signed-in secretary to transcribe a paper or day-of entry.</w:t>
             </w:r>
           </w:p>
         </w:tc>
@@ -10508,6 +10566,90 @@
                 <w:color w:val="18232F"/>
                 <w:sz w:val="19"/>
               </w:rPr>
+              <w:t>Import Google Form CSV</w:t>
+            </w:r>
+          </w:p>
+        </w:tc>
+        <w:tc>
+          <w:tcPr>
+            <w:tcW w:type="dxa" w:w="2592"/>
+            <w:vAlign w:val="center"/>
+            <w:tcMar>
+              <w:top w:w="80" w:type="dxa"/>
+              <w:start w:w="120" w:type="dxa"/>
+              <w:bottom w:w="80" w:type="dxa"/>
+              <w:end w:w="120" w:type="dxa"/>
+            </w:tcMar>
+          </w:tcPr>
+          <w:p>
+            <w:pPr>
+              <w:spacing w:after="0"/>
+            </w:pPr>
+            <w:r/>
+            <w:r>
+              <w:rPr>
+                <w:rFonts w:ascii="Calibri" w:hAnsi="Calibri"/>
+                <w:b w:val="0"/>
+                <w:color w:val="18232F"/>
+                <w:sz w:val="19"/>
+              </w:rPr>
+              <w:t>Entries</w:t>
+            </w:r>
+          </w:p>
+        </w:tc>
+        <w:tc>
+          <w:tcPr>
+            <w:tcW w:type="dxa" w:w="5616"/>
+            <w:vAlign w:val="center"/>
+            <w:tcMar>
+              <w:top w:w="80" w:type="dxa"/>
+              <w:start w:w="120" w:type="dxa"/>
+              <w:bottom w:w="80" w:type="dxa"/>
+              <w:end w:w="120" w:type="dxa"/>
+            </w:tcMar>
+          </w:tcPr>
+          <w:p>
+            <w:pPr>
+              <w:spacing w:after="0"/>
+            </w:pPr>
+            <w:r/>
+            <w:r>
+              <w:rPr>
+                <w:rFonts w:ascii="Calibri" w:hAnsi="Calibri"/>
+                <w:b w:val="0"/>
+                <w:color w:val="18232F"/>
+                <w:sz w:val="19"/>
+              </w:rPr>
+              <w:t>Selects and previews a familiar Google response CSV.</w:t>
+            </w:r>
+          </w:p>
+        </w:tc>
+      </w:tr>
+      <w:tr>
+        <w:tc>
+          <w:tcPr>
+            <w:tcW w:type="dxa" w:w="2736"/>
+            <w:vAlign w:val="center"/>
+            <w:tcMar>
+              <w:top w:w="80" w:type="dxa"/>
+              <w:start w:w="120" w:type="dxa"/>
+              <w:bottom w:w="80" w:type="dxa"/>
+              <w:end w:w="120" w:type="dxa"/>
+            </w:tcMar>
+            <w:shd w:fill="F7F8F4"/>
+          </w:tcPr>
+          <w:p>
+            <w:pPr>
+              <w:spacing w:after="0"/>
+            </w:pPr>
+            <w:r/>
+            <w:r>
+              <w:rPr>
+                <w:rFonts w:ascii="Calibri" w:hAnsi="Calibri"/>
+                <w:b w:val="0"/>
+                <w:color w:val="18232F"/>
+                <w:sz w:val="19"/>
+              </w:rPr>
               <w:t>Import entries</w:t>
             </w:r>
           </w:p>
@@ -10522,6 +10664,7 @@
               <w:bottom w:w="80" w:type="dxa"/>
               <w:end w:w="120" w:type="dxa"/>
             </w:tcMar>
+            <w:shd w:fill="F7F8F4"/>
           </w:tcPr>
           <w:p>
             <w:pPr>
@@ -10549,6 +10692,7 @@
               <w:bottom w:w="80" w:type="dxa"/>
               <w:end w:w="120" w:type="dxa"/>
             </w:tcMar>
+            <w:shd w:fill="F7F8F4"/>
           </w:tcPr>
           <w:p>
             <w:pPr>
@@ -10578,6 +10722,89 @@
               <w:bottom w:w="80" w:type="dxa"/>
               <w:end w:w="120" w:type="dxa"/>
             </w:tcMar>
+          </w:tcPr>
+          <w:p>
+            <w:pPr>
+              <w:spacing w:after="0"/>
+            </w:pPr>
+            <w:r/>
+            <w:r>
+              <w:rPr>
+                <w:rFonts w:ascii="Calibri" w:hAnsi="Calibri"/>
+                <w:b w:val="0"/>
+                <w:color w:val="18232F"/>
+                <w:sz w:val="19"/>
+              </w:rPr>
+              <w:t>Edit entry</w:t>
+            </w:r>
+          </w:p>
+        </w:tc>
+        <w:tc>
+          <w:tcPr>
+            <w:tcW w:type="dxa" w:w="2592"/>
+            <w:vAlign w:val="center"/>
+            <w:tcMar>
+              <w:top w:w="80" w:type="dxa"/>
+              <w:start w:w="120" w:type="dxa"/>
+              <w:bottom w:w="80" w:type="dxa"/>
+              <w:end w:w="120" w:type="dxa"/>
+            </w:tcMar>
+          </w:tcPr>
+          <w:p>
+            <w:pPr>
+              <w:spacing w:after="0"/>
+            </w:pPr>
+            <w:r/>
+            <w:r>
+              <w:rPr>
+                <w:rFonts w:ascii="Calibri" w:hAnsi="Calibri"/>
+                <w:b w:val="0"/>
+                <w:color w:val="18232F"/>
+                <w:sz w:val="19"/>
+              </w:rPr>
+              <w:t>Entry card</w:t>
+            </w:r>
+          </w:p>
+        </w:tc>
+        <w:tc>
+          <w:tcPr>
+            <w:tcW w:type="dxa" w:w="5616"/>
+            <w:vAlign w:val="center"/>
+            <w:tcMar>
+              <w:top w:w="80" w:type="dxa"/>
+              <w:start w:w="120" w:type="dxa"/>
+              <w:bottom w:w="80" w:type="dxa"/>
+              <w:end w:w="120" w:type="dxa"/>
+            </w:tcMar>
+          </w:tcPr>
+          <w:p>
+            <w:pPr>
+              <w:spacing w:after="0"/>
+            </w:pPr>
+            <w:r/>
+            <w:r>
+              <w:rPr>
+                <w:rFonts w:ascii="Calibri" w:hAnsi="Calibri"/>
+                <w:b w:val="0"/>
+                <w:color w:val="18232F"/>
+                <w:sz w:val="19"/>
+              </w:rPr>
+              <w:t>Opens the secretary edit form with the current entry repopulated.</w:t>
+            </w:r>
+          </w:p>
+        </w:tc>
+      </w:tr>
+      <w:tr>
+        <w:tc>
+          <w:tcPr>
+            <w:tcW w:type="dxa" w:w="2736"/>
+            <w:vAlign w:val="center"/>
+            <w:tcMar>
+              <w:top w:w="80" w:type="dxa"/>
+              <w:start w:w="120" w:type="dxa"/>
+              <w:bottom w:w="80" w:type="dxa"/>
+              <w:end w:w="120" w:type="dxa"/>
+            </w:tcMar>
             <w:shd w:fill="F7F8F4"/>
           </w:tcPr>
           <w:p>
@@ -10592,7 +10819,7 @@
                 <w:color w:val="18232F"/>
                 <w:sz w:val="19"/>
               </w:rPr>
-              <w:t>Edit entry</w:t>
+              <w:t>Secretary decision</w:t>
             </w:r>
           </w:p>
         </w:tc>
@@ -10648,7 +10875,7 @@
                 <w:color w:val="18232F"/>
                 <w:sz w:val="19"/>
               </w:rPr>
-              <w:t>Opens the secretary edit form with the current entry repopulated.</w:t>
+              <w:t>Changes Received to Accepted, Waitlisted, Rejected, Withdrawn, or another permitted status.</w:t>
             </w:r>
           </w:p>
         </w:tc>
@@ -10677,90 +10904,6 @@
                 <w:color w:val="18232F"/>
                 <w:sz w:val="19"/>
               </w:rPr>
-              <w:t>Secretary decision</w:t>
-            </w:r>
-          </w:p>
-        </w:tc>
-        <w:tc>
-          <w:tcPr>
-            <w:tcW w:type="dxa" w:w="2592"/>
-            <w:vAlign w:val="center"/>
-            <w:tcMar>
-              <w:top w:w="80" w:type="dxa"/>
-              <w:start w:w="120" w:type="dxa"/>
-              <w:bottom w:w="80" w:type="dxa"/>
-              <w:end w:w="120" w:type="dxa"/>
-            </w:tcMar>
-          </w:tcPr>
-          <w:p>
-            <w:pPr>
-              <w:spacing w:after="0"/>
-            </w:pPr>
-            <w:r/>
-            <w:r>
-              <w:rPr>
-                <w:rFonts w:ascii="Calibri" w:hAnsi="Calibri"/>
-                <w:b w:val="0"/>
-                <w:color w:val="18232F"/>
-                <w:sz w:val="19"/>
-              </w:rPr>
-              <w:t>Entry card</w:t>
-            </w:r>
-          </w:p>
-        </w:tc>
-        <w:tc>
-          <w:tcPr>
-            <w:tcW w:type="dxa" w:w="5616"/>
-            <w:vAlign w:val="center"/>
-            <w:tcMar>
-              <w:top w:w="80" w:type="dxa"/>
-              <w:start w:w="120" w:type="dxa"/>
-              <w:bottom w:w="80" w:type="dxa"/>
-              <w:end w:w="120" w:type="dxa"/>
-            </w:tcMar>
-          </w:tcPr>
-          <w:p>
-            <w:pPr>
-              <w:spacing w:after="0"/>
-            </w:pPr>
-            <w:r/>
-            <w:r>
-              <w:rPr>
-                <w:rFonts w:ascii="Calibri" w:hAnsi="Calibri"/>
-                <w:b w:val="0"/>
-                <w:color w:val="18232F"/>
-                <w:sz w:val="19"/>
-              </w:rPr>
-              <w:t>Changes Received to Accepted, Waitlisted, Rejected, Withdrawn, or another permitted status.</w:t>
-            </w:r>
-          </w:p>
-        </w:tc>
-      </w:tr>
-      <w:tr>
-        <w:tc>
-          <w:tcPr>
-            <w:tcW w:type="dxa" w:w="2736"/>
-            <w:vAlign w:val="center"/>
-            <w:tcMar>
-              <w:top w:w="80" w:type="dxa"/>
-              <w:start w:w="120" w:type="dxa"/>
-              <w:bottom w:w="80" w:type="dxa"/>
-              <w:end w:w="120" w:type="dxa"/>
-            </w:tcMar>
-            <w:shd w:fill="F7F8F4"/>
-          </w:tcPr>
-          <w:p>
-            <w:pPr>
-              <w:spacing w:after="0"/>
-            </w:pPr>
-            <w:r/>
-            <w:r>
-              <w:rPr>
-                <w:rFonts w:ascii="Calibri" w:hAnsi="Calibri"/>
-                <w:b w:val="0"/>
-                <w:color w:val="18232F"/>
-                <w:sz w:val="19"/>
-              </w:rPr>
               <w:t>Print or Save PDF</w:t>
             </w:r>
           </w:p>
@@ -10775,7 +10918,6 @@
               <w:bottom w:w="80" w:type="dxa"/>
               <w:end w:w="120" w:type="dxa"/>
             </w:tcMar>
-            <w:shd w:fill="F7F8F4"/>
           </w:tcPr>
           <w:p>
             <w:pPr>
@@ -10803,7 +10945,6 @@
               <w:bottom w:w="80" w:type="dxa"/>
               <w:end w:w="120" w:type="dxa"/>
             </w:tcMar>
-            <w:shd w:fill="F7F8F4"/>
           </w:tcPr>
           <w:p>
             <w:pPr>

</xml_diff>

<commit_message>
Document automatic entry scheduling
</commit_message>
<xml_diff>
--- a/docs/manual/SDDA-TrialDesk-Secretary-Manual.docx
+++ b/docs/manual/SDDA-TrialDesk-Secretary-Manual.docx
@@ -1536,10 +1536,25 @@
           <w:b/>
           <w:color w:val="294F73"/>
         </w:rPr>
-        <w:t xml:space="preserve">4. Save public details. </w:t>
-      </w:r>
-      <w:r>
-        <w:t>These details appear on the competitor entry form.</w:t>
+        <w:t xml:space="preserve">4. Set the automatic entry schedule. </w:t>
+      </w:r>
+      <w:r>
+        <w:t>Enter the general opening date/time and public closing date/time. TrialDesk calculates the registered-participant opening exactly three days before the general opening.</w:t>
+      </w:r>
+    </w:p>
+    <w:p>
+      <w:pPr>
+        <w:ind w:left="72" w:hanging="72"/>
+      </w:pPr>
+      <w:r>
+        <w:rPr>
+          <w:b/>
+          <w:color w:val="294F73"/>
+        </w:rPr>
+        <w:t xml:space="preserve">5. Save public details and entry schedule. </w:t>
+      </w:r>
+      <w:r>
+        <w:t>The dashboard shows the current phase: Scheduled, Registered participants only, Open to everyone, Automatically closed, or Manually closed.</w:t>
       </w:r>
     </w:p>
     <w:p>
@@ -1680,7 +1695,7 @@
         <w:t xml:space="preserve">3. Save setup. </w:t>
       </w:r>
       <w:r>
-        <w:t>Do this before opening or copying the entry form link.</w:t>
+        <w:t>Do this before sharing the entry form link. The public form activates automatically at the scheduled time.</w:t>
       </w:r>
     </w:p>
     <w:tbl>
@@ -1949,10 +1964,10 @@
           <w:b/>
           <w:color w:val="294F73"/>
         </w:rPr>
-        <w:t xml:space="preserve">2. Open entries. </w:t>
-      </w:r>
-      <w:r>
-        <w:t>Use the trial’s entry-status control only after the public form is ready.</w:t>
+        <w:t xml:space="preserve">2. Confirm the automatic schedule. </w:t>
+      </w:r>
+      <w:r>
+        <w:t>Registered participants open three days before the general opening. During that early period, TrialDesk requires a participant number that matches the active SDDA registry. General entry and closing occur automatically.</w:t>
       </w:r>
     </w:p>
     <w:p>
@@ -1967,7 +1982,22 @@
         <w:t xml:space="preserve">3. Copy entry form link. </w:t>
       </w:r>
       <w:r>
-        <w:t>Send the public link or place it in the approved Premium/club communication.</w:t>
+        <w:t>Send the public link or place it in the approved Premium/club communication. It may be shared ahead of time; submissions remain blocked until the scheduled opening.</w:t>
+      </w:r>
+    </w:p>
+    <w:p>
+      <w:pPr>
+        <w:ind w:left="72" w:hanging="72"/>
+      </w:pPr>
+      <w:r>
+        <w:rPr>
+          <w:b/>
+          <w:color w:val="294F73"/>
+        </w:rPr>
+        <w:t xml:space="preserve">4. Use manual closure only when needed. </w:t>
+      </w:r>
+      <w:r>
+        <w:t>Close entries stops all new public submissions immediately. Per-day controls can close a full day while leaving other days available. Reopening restores the remaining scheduled window; it does not extend the closing time.</w:t>
       </w:r>
     </w:p>
     <w:p>
@@ -2152,7 +2182,7 @@
     </w:p>
     <w:p>
       <w:r>
-        <w:t>The same registry, offering, FEO, stream, and required-field checks used by the public form also apply to secretary-entered records. If online entries are closed, reopen the applicable entry period before adding the record, then close it again when finished.</w:t>
+        <w:t>The same registry, offering, FEO, stream, and required-field checks used by the public form also apply to secretary-entered records. Public opening and closing times do not restrict this signed-in workflow: the secretary may enter hosts before opening, transcribe paper entries, or add approved day-of entries after public closing without reopening the public form.</w:t>
       </w:r>
     </w:p>
     <w:p>
@@ -7289,7 +7319,7 @@
                 <w:color w:val="18232F"/>
                 <w:sz w:val="19"/>
               </w:rPr>
-              <w:t>Save public details</w:t>
+              <w:t>Save public details and entry schedule</w:t>
             </w:r>
           </w:p>
         </w:tc>
@@ -7343,7 +7373,7 @@
                 <w:color w:val="18232F"/>
                 <w:sz w:val="19"/>
               </w:rPr>
-              <w:t>Saves secretary contact, payment, and cancellation text.</w:t>
+              <w:t>Saves secretary contact, payment and cancellation text plus the general opening and public closing times. Registered participants open three days early.</w:t>
             </w:r>
           </w:p>
         </w:tc>
@@ -7681,7 +7711,7 @@
                 <w:color w:val="18232F"/>
                 <w:sz w:val="19"/>
               </w:rPr>
-              <w:t>Changes the trial to Entries Open and activates submissions.</w:t>
+              <w:t>Re-enables the public form after a manual closure; scheduled opening and closing times still control availability.</w:t>
             </w:r>
           </w:p>
         </w:tc>
@@ -7767,7 +7797,7 @@
                 <w:color w:val="18232F"/>
                 <w:sz w:val="19"/>
               </w:rPr>
-              <w:t>Stops new public submissions for the whole trial.</w:t>
+              <w:t>Emergency manual closure that immediately stops new public submissions for the whole trial without restricting secretary entry or editing.</w:t>
             </w:r>
           </w:p>
         </w:tc>

</xml_diff>